<commit_message>
data : Subset of fashion-mnist dataset
</commit_message>
<xml_diff>
--- a/nlp/NLP_experiments/exp2and3.docx
+++ b/nlp/NLP_experiments/exp2and3.docx
@@ -213,12 +213,6 @@
           <w:sz w:val="21"/>
         </w:rPr>
         <w:tab/>
-      </w:r>
-      <w:r>
-        <w:rPr>
-          <w:rFonts w:ascii="Consolas" w:eastAsia="Consolas" w:hAnsi="Consolas" w:cs="Consolas"/>
-          <w:sz w:val="21"/>
-        </w:rPr>
         <w:t xml:space="preserve"> </w:t>
       </w:r>
     </w:p>
@@ -254,14 +248,7 @@
           <w:b/>
           <w:sz w:val="28"/>
         </w:rPr>
-        <w:t xml:space="preserve">Experiment No. </w:t>
-      </w:r>
-      <w:r>
-        <w:rPr>
-          <w:b/>
-          <w:sz w:val="28"/>
-        </w:rPr>
-        <w:t>3</w:t>
+        <w:t>Experiment No. 3</w:t>
       </w:r>
     </w:p>
     <w:p>
@@ -528,10 +515,6 @@
     </w:r>
     <w:r>
       <w:tab/>
-      <w:t xml:space="preserve">  </w:t>
-    </w:r>
-    <w:r>
-      <w:t xml:space="preserve">Ayush Devadiga,12 </w:t>
     </w:r>
     <w:r>
       <w:ptab w:relativeTo="margin" w:alignment="right" w:leader="none"/>

</xml_diff>